<commit_message>
docs: DPIA for AI-first document checks (about 90% automatic, human when needed)
Co-Authored-By: Claude Sonnet 5.5 <noreply@anthropic.com>
</commit_message>
<xml_diff>
--- a/docs/legal-drafts/dpia-ai-document-checks-draft.docx
+++ b/docs/legal-drafts/dpia-ai-document-checks-draft.docx
@@ -45,7 +45,7 @@
         <w:t>docs/required-documents-draft.md</w:t>
       </w:r>
       <w:r>
-        <w:t>). Staff check each document and approve or reject it. The planned change: after upload, an AI vision model reads the document and returns a fixed set of fields. Staff see them as a pre-filled checklist next to the document. The AI gives advice only. A staff member decides every approval and every rejection.</w:t>
+        <w:t>). Staff check each document and approve or reject it. The planned change: after upload, an AI vision model reads the document and returns a fixed set of fields. Owner decision of 28 October 2026: the AI handles about 90% of the checks; a person looks only when needed (see section 1a). The AI may approve a document by itself when every check passes. It never rejects by itself: anything doubtful goes to a staff member.</w:t>
       </w:r>
     </w:p>
     <w:p>
@@ -383,7 +383,7 @@
         <w:pStyle w:val="ListNumber"/>
       </w:pPr>
       <w:r>
-        <w:t>A staff member sees the document and the advisory checklist and decides. The decision and the staff note are recorded as today.</w:t>
+        <w:t>If all checks pass with high confidence and the document type allows it (section 1a), the document is approved automatically and the decision is logged with the fields. Otherwise it goes to the staff queue: a staff member sees the document and the checklist and decides. Every rejection is a staff decision.</w:t>
       </w:r>
     </w:p>
     <w:p>
@@ -425,6 +425,213 @@
       </w:r>
       <w:r>
         <w:t xml:space="preserve"> Vision model called by a server-side background job. Documents stay in private storage; the job reads them with a short-lived access link. No document is sent from the phone to the AI provider directly.</w:t>
+      </w:r>
+    </w:p>
+    <w:p>
+      <w:pPr>
+        <w:pStyle w:val="Heading2"/>
+      </w:pPr>
+      <w:r>
+        <w:t>1a. Operating model: AI first, a person when needed</w:t>
+      </w:r>
+    </w:p>
+    <w:tbl>
+      <w:tblPr>
+        <w:tblStyle w:val="TableGrid"/>
+        <w:tblW w:type="auto" w:w="0"/>
+        <w:tblLook w:firstColumn="1" w:firstRow="1" w:lastColumn="0" w:lastRow="0" w:noHBand="0" w:noVBand="1" w:val="04A0"/>
+      </w:tblPr>
+      <w:tblGrid>
+        <w:gridCol w:w="4320"/>
+        <w:gridCol w:w="4320"/>
+      </w:tblGrid>
+      <w:tr>
+        <w:tc>
+          <w:tcPr>
+            <w:tcW w:type="dxa" w:w="4320"/>
+          </w:tcPr>
+          <w:p>
+            <w:r>
+              <w:rPr>
+                <w:b/>
+              </w:rPr>
+            </w:r>
+            <w:r>
+              <w:rPr>
+                <w:b/>
+              </w:rPr>
+              <w:t>Situation</w:t>
+            </w:r>
+          </w:p>
+        </w:tc>
+        <w:tc>
+          <w:tcPr>
+            <w:tcW w:type="dxa" w:w="4320"/>
+          </w:tcPr>
+          <w:p>
+            <w:r>
+              <w:rPr>
+                <w:b/>
+              </w:rPr>
+            </w:r>
+            <w:r>
+              <w:rPr>
+                <w:b/>
+              </w:rPr>
+              <w:t>Who decides</w:t>
+            </w:r>
+          </w:p>
+        </w:tc>
+      </w:tr>
+      <w:tr>
+        <w:tc>
+          <w:tcPr>
+            <w:tcW w:type="dxa" w:w="4320"/>
+          </w:tcPr>
+          <w:p>
+            <w:r/>
+            <w:r>
+              <w:t>All checks pass, confidence above the set threshold, document type allows automatic approval</w:t>
+            </w:r>
+          </w:p>
+        </w:tc>
+        <w:tc>
+          <w:tcPr>
+            <w:tcW w:type="dxa" w:w="4320"/>
+          </w:tcPr>
+          <w:p>
+            <w:r/>
+            <w:r>
+              <w:t>AI approves; logged; counts towards the sample audit</w:t>
+            </w:r>
+          </w:p>
+        </w:tc>
+      </w:tr>
+      <w:tr>
+        <w:tc>
+          <w:tcPr>
+            <w:tcW w:type="dxa" w:w="4320"/>
+          </w:tcPr>
+          <w:p>
+            <w:r/>
+            <w:r>
+              <w:t>Any check fails, low confidence, a flag (edited, text layer disagrees), unreadable, expired, name does not match</w:t>
+            </w:r>
+          </w:p>
+        </w:tc>
+        <w:tc>
+          <w:tcPr>
+            <w:tcW w:type="dxa" w:w="4320"/>
+          </w:tcPr>
+          <w:p>
+            <w:r/>
+            <w:r>
+              <w:t>Staff queue; staff decide</w:t>
+            </w:r>
+          </w:p>
+        </w:tc>
+      </w:tr>
+      <w:tr>
+        <w:tc>
+          <w:tcPr>
+            <w:tcW w:type="dxa" w:w="4320"/>
+          </w:tcPr>
+          <w:p>
+            <w:r/>
+            <w:r>
+              <w:t>AI wants to reject</w:t>
+            </w:r>
+          </w:p>
+        </w:tc>
+        <w:tc>
+          <w:tcPr>
+            <w:tcW w:type="dxa" w:w="4320"/>
+          </w:tcPr>
+          <w:p>
+            <w:r/>
+            <w:r>
+              <w:t>Never automatic: staff queue, and the provider gets a human-written reason</w:t>
+            </w:r>
+          </w:p>
+        </w:tc>
+      </w:tr>
+      <w:tr>
+        <w:tc>
+          <w:tcPr>
+            <w:tcW w:type="dxa" w:w="4320"/>
+          </w:tcPr>
+          <w:p>
+            <w:r/>
+            <w:r>
+              <w:t>Police certificate showing anything other than "no entries"; extended certificate for Babysitting</w:t>
+            </w:r>
+          </w:p>
+        </w:tc>
+        <w:tc>
+          <w:tcPr>
+            <w:tcW w:type="dxa" w:w="4320"/>
+          </w:tcPr>
+          <w:p>
+            <w:r/>
+            <w:r>
+              <w:t>Always staff, no automatic approval</w:t>
+            </w:r>
+          </w:p>
+        </w:tc>
+      </w:tr>
+      <w:tr>
+        <w:tc>
+          <w:tcPr>
+            <w:tcW w:type="dxa" w:w="4320"/>
+          </w:tcPr>
+          <w:p>
+            <w:r/>
+            <w:r>
+              <w:t>Provider's first documents (first [50] approvals) and any provider with an earlier rejection or complaint</w:t>
+            </w:r>
+          </w:p>
+        </w:tc>
+        <w:tc>
+          <w:tcPr>
+            <w:tcW w:type="dxa" w:w="4320"/>
+          </w:tcPr>
+          <w:p>
+            <w:r/>
+            <w:r>
+              <w:t>Staff until trust is established [to decide]</w:t>
+            </w:r>
+          </w:p>
+        </w:tc>
+      </w:tr>
+      <w:tr>
+        <w:tc>
+          <w:tcPr>
+            <w:tcW w:type="dxa" w:w="4320"/>
+          </w:tcPr>
+          <w:p>
+            <w:r/>
+            <w:r>
+              <w:t>Random sample of automatic approvals (about 10%, [to decide])</w:t>
+            </w:r>
+          </w:p>
+        </w:tc>
+        <w:tc>
+          <w:tcPr>
+            <w:tcW w:type="dxa" w:w="4320"/>
+          </w:tcPr>
+          <w:p>
+            <w:r/>
+            <w:r>
+              <w:t>Staff re-check afterwards; wrong approvals are withdrawn</w:t>
+            </w:r>
+          </w:p>
+        </w:tc>
+      </w:tr>
+    </w:tbl>
+    <w:p/>
+    <w:p>
+      <w:r>
+        <w:t>Target: about 90% of documents decided without a person. The share is measured monthly; the thresholds are tuned on the [300]-document test before launch and may be stricter at first. Photo ID: automatic approval only for the checks listed (type, name match, not expired, readable); no biometric face comparison.</w:t>
       </w:r>
     </w:p>
     <w:p>
@@ -488,7 +695,7 @@
         <w:t>Automated decisions (Art. 22).</w:t>
       </w:r>
       <w:r>
-        <w:t xml:space="preserve"> None. Approval and rejection are always made by a staff member who looks at the document. The AI output is shown as advice with its confidence and flags; reviewers are trained to check the document, and the back office records that the reviewer opened the document. There is no automatic approval and no automatic rejection.</w:t>
+        <w:t xml:space="preserve"> Automatic approval is a decision based solely on automated processing. Approving is favourable to the provider, and the risk is lower than for a refusal, but a document check decides whether a person may offer services, so safeguards apply: no automatic rejection; a human always decides doubtful cases; the provider can ask for a person to review any decision and can resubmit; the logic and thresholds are described in the privacy policy; monthly sample audits; automatic approval can be switched off per document type with one setting. Criminal-conviction data (police certificate) is never decided automatically in the adverse direction, and the extended certificate for child care is always checked by a person. [Lawyer to confirm that this model is lawful under Art. 22(2) and German law; if not, the AI step falls back to advice only.]</w:t>
       </w:r>
     </w:p>
     <w:p>
@@ -884,7 +1091,7 @@
           <w:p>
             <w:r/>
             <w:r>
-              <w:t>Reviewers rubber-stamp the AI (de facto automated decision)</w:t>
+              <w:t>Wrong automatic approvals (forged, expired or someone else's document accepted) and staff who rubber-stamp the AI queue</w:t>
             </w:r>
           </w:p>
         </w:tc>
@@ -906,7 +1113,7 @@
           <w:p>
             <w:r/>
             <w:r>
-              <w:t>Checklist is advice only; reviewer must open the document before the buttons work; monthly sample audit of decisions; training; no auto-approval</w:t>
+              <w:t>Strict thresholds; sensitive types always human; sample audit of about 10% of automatic approvals; withdrawal of wrong approvals; reviewer must open the document before the buttons work; approval rate and error rate reported monthly</w:t>
             </w:r>
           </w:p>
         </w:tc>
@@ -917,7 +1124,7 @@
           <w:p>
             <w:r/>
             <w:r>
-              <w:t>Low</w:t>
+              <w:t>Medium (accepted)</w:t>
             </w:r>
           </w:p>
         </w:tc>
@@ -1365,7 +1572,7 @@
     </w:p>
     <w:p>
       <w:r>
-        <w:t>Expected result: the processing is acceptable with the measures above, a human making every decision, and a provider that meets the conditions in section 3. If any of these cannot be met (EU servers, zero retention and no training, a data-processing agreement, lawyer confirmation for criminal-conviction data), the AI step is NOT started for the affected document types.</w:t>
+        <w:t>Expected result: the processing is acceptable with the measures above, a human deciding every rejection and every doubtful case, and a provider that meets the conditions in section 3. If any of these cannot be met (EU servers, zero retention and no training, a data-processing agreement, lawyer confirmation for criminal-conviction data), the AI step is NOT started for the affected document types.</w:t>
       </w:r>
     </w:p>
     <w:p>

</xml_diff>

<commit_message>
docs: record owner decisions on AI-first document checks
Co-Authored-By: Claude Sonnet 5.5 <noreply@anthropic.com>
</commit_message>
<xml_diff>
--- a/docs/legal-drafts/dpia-ai-document-checks-draft.docx
+++ b/docs/legal-drafts/dpia-ai-document-checks-draft.docx
@@ -45,7 +45,7 @@
         <w:t>docs/required-documents-draft.md</w:t>
       </w:r>
       <w:r>
-        <w:t>). Staff check each document and approve or reject it. The planned change: after upload, an AI vision model reads the document and returns a fixed set of fields. Owner decision of 28 October 2026: the AI handles about 90% of the checks; a person looks only when needed (see section 1a). The AI may approve a document by itself when every check passes. It never rejects by itself: anything doubtful goes to a staff member.</w:t>
+        <w:t>). Staff check each document and approve or reject it. The planned change: after upload, an AI vision model reads the document and returns a fixed set of fields. Owner decision of 28 October 2026: the AI handles about 90% of the checks; a person looks only when needed (see section 1a). The AI may approve a document by itself when every check passes. It never rejects by itself: anything doubtful goes to a staff member (owner confirmed, 28 October: no automatic rejection, about 10% sample audit, first approvals by a person).</w:t>
       </w:r>
     </w:p>
     <w:p>
@@ -598,7 +598,7 @@
           <w:p>
             <w:r/>
             <w:r>
-              <w:t>Staff until trust is established [to decide]</w:t>
+              <w:t>Staff until trust is established (owner confirmed, 28 October)</w:t>
             </w:r>
           </w:p>
         </w:tc>
@@ -611,7 +611,7 @@
           <w:p>
             <w:r/>
             <w:r>
-              <w:t>Random sample of automatic approvals (about 10%, [to decide])</w:t>
+              <w:t>Random sample of automatic approvals (about 10%, owner confirmed, 28 October)</w:t>
             </w:r>
           </w:p>
         </w:tc>

</xml_diff>